<commit_message>
docs: Etapa 5.1 — revisão técnica dos Termos de Uso (v0.2) + versionamento jurídico
- Termos de Uso v0.2: reconcilia proibição de engenharia reversa com a licença
  MIT do código-fonte, adiciona cláusulas de disponibilidade/suspensão do
  serviço, atualizações do app, propriedade das contribuições ao dicionário
  (CC0) e limitação de responsabilidade quanto a APIs de terceiros
- Cria Políticas/Versões Jurídicas/ com snapshot v0.1 de todos os 5 documentos
  e v0.2 dos Termos de Uso, seguindo a convenção de versão do 2º parecer
  jurídico (v0.1 Rascunho → v0.2 Revisão Técnica → v0.3 Revisão Jurídica → v1.0)
- Adiciona selo de versão v0.1 aos outros 4 documentos (ainda não revisados)
- Atualiza CLAUDE.md com a estrutura de Etapas 5-12 do parecer e a convenção
  de versionamento
</commit_message>
<xml_diff>
--- a/Políticas/Termos_de_Uso_Campfire_Tradutor.docx
+++ b/Políticas/Termos_de_Uso_Campfire_Tradutor.docx
@@ -30,7 +30,7 @@
           <w:sz w:val="20"/>
           <w:szCs w:val="20"/>
         </w:rPr>
-        <w:t xml:space="preserve">Última atualização: [DATA]</w:t>
+        <w:t xml:space="preserve">Versão: v0.2 — Revisão Técnica  ·  Data: [DATA]</w:t>
       </w:r>
     </w:p>
     <w:p>
@@ -49,7 +49,7 @@
           <w:sz w:val="20"/>
           <w:szCs w:val="20"/>
         </w:rPr>
-        <w:t xml:space="preserve">RASCUNHO PARA REVISÃO JURÍDICA — campos entre colchetes [ ] ainda precisam ser confirmados antes da publicação oficial.</w:t>
+        <w:t xml:space="preserve">REVISÃO TÉCNICA (Claude) — aguardando Revisão Jurídica (advogado) para virar v0.3. Campos entre colchetes [ ] ainda precisam ser confirmados.</w:t>
       </w:r>
     </w:p>
     <w:p>
@@ -75,6 +75,8 @@
       <w:r>
         <w:rPr>
           <w:rFonts w:ascii="Calibri" w:cs="Calibri" w:eastAsia="Calibri" w:hAnsi="Calibri"/>
+          <w:b w:val="false"/>
+          <w:bCs w:val="false"/>
           <w:sz w:val="22"/>
           <w:szCs w:val="22"/>
         </w:rPr>
@@ -88,6 +90,8 @@
       <w:r>
         <w:rPr>
           <w:rFonts w:ascii="Calibri" w:cs="Calibri" w:eastAsia="Calibri" w:hAnsi="Calibri"/>
+          <w:b w:val="false"/>
+          <w:bCs w:val="false"/>
           <w:sz w:val="22"/>
           <w:szCs w:val="22"/>
         </w:rPr>
@@ -117,6 +121,8 @@
       <w:r>
         <w:rPr>
           <w:rFonts w:ascii="Calibri" w:cs="Calibri" w:eastAsia="Calibri" w:hAnsi="Calibri"/>
+          <w:b w:val="false"/>
+          <w:bCs w:val="false"/>
           <w:sz w:val="22"/>
           <w:szCs w:val="22"/>
         </w:rPr>
@@ -135,6 +141,8 @@
       <w:r>
         <w:rPr>
           <w:rFonts w:ascii="Calibri" w:cs="Calibri" w:eastAsia="Calibri" w:hAnsi="Calibri"/>
+          <w:b w:val="false"/>
+          <w:bCs w:val="false"/>
           <w:sz w:val="22"/>
           <w:szCs w:val="22"/>
         </w:rPr>
@@ -153,6 +161,8 @@
       <w:r>
         <w:rPr>
           <w:rFonts w:ascii="Calibri" w:cs="Calibri" w:eastAsia="Calibri" w:hAnsi="Calibri"/>
+          <w:b w:val="false"/>
+          <w:bCs w:val="false"/>
           <w:sz w:val="22"/>
           <w:szCs w:val="22"/>
         </w:rPr>
@@ -171,6 +181,8 @@
       <w:r>
         <w:rPr>
           <w:rFonts w:ascii="Calibri" w:cs="Calibri" w:eastAsia="Calibri" w:hAnsi="Calibri"/>
+          <w:b w:val="false"/>
+          <w:bCs w:val="false"/>
           <w:sz w:val="22"/>
           <w:szCs w:val="22"/>
         </w:rPr>
@@ -200,23 +212,82 @@
       <w:r>
         <w:rPr>
           <w:rFonts w:ascii="Calibri" w:cs="Calibri" w:eastAsia="Calibri" w:hAnsi="Calibri"/>
-          <w:sz w:val="22"/>
-          <w:szCs w:val="22"/>
-        </w:rPr>
-        <w:t xml:space="preserve">Determinados formatos e funcionalidades exigem que o usuário forneça sua própria chave de API da Anthropic (e, opcionalmente, um token da Hugging Face para transcrição de áudio). O Desenvolvedor não fornece, vende ou intermedia essas chaves e não tem acesso a elas além do armazenamento local no dispositivo do usuário.</w:t>
-      </w:r>
-    </w:p>
-    <w:p>
-      <w:pPr>
-        <w:spacing w:after="200"/>
-      </w:pPr>
-      <w:r>
-        <w:rPr>
-          <w:rFonts w:ascii="Calibri" w:cs="Calibri" w:eastAsia="Calibri" w:hAnsi="Calibri"/>
+          <w:b w:val="false"/>
+          <w:bCs w:val="false"/>
+          <w:sz w:val="22"/>
+          <w:szCs w:val="22"/>
+        </w:rPr>
+        <w:t xml:space="preserve">Determinados formatos e funcionalidades exigem que o usuário forneça sua própria chave de API da Anthropic (e, opcionalmente, um token da Hugging Face para transcrição de áudio). O Desenvolvedor </w:t>
+      </w:r>
+      <w:r>
+        <w:rPr>
+          <w:rFonts w:ascii="Calibri" w:cs="Calibri" w:eastAsia="Calibri" w:hAnsi="Calibri"/>
+          <w:b/>
+          <w:bCs/>
+          <w:sz w:val="22"/>
+          <w:szCs w:val="22"/>
+        </w:rPr>
+        <w:t xml:space="preserve">não fornece, vende ou intermedia</w:t>
+      </w:r>
+      <w:r>
+        <w:rPr>
+          <w:rFonts w:ascii="Calibri" w:cs="Calibri" w:eastAsia="Calibri" w:hAnsi="Calibri"/>
+          <w:b w:val="false"/>
+          <w:bCs w:val="false"/>
+          <w:sz w:val="22"/>
+          <w:szCs w:val="22"/>
+        </w:rPr>
+        <w:t xml:space="preserve"> essas chaves e </w:t>
+      </w:r>
+      <w:r>
+        <w:rPr>
+          <w:rFonts w:ascii="Calibri" w:cs="Calibri" w:eastAsia="Calibri" w:hAnsi="Calibri"/>
+          <w:b/>
+          <w:bCs/>
+          <w:sz w:val="22"/>
+          <w:szCs w:val="22"/>
+        </w:rPr>
+        <w:t xml:space="preserve">não tem acesso</w:t>
+      </w:r>
+      <w:r>
+        <w:rPr>
+          <w:rFonts w:ascii="Calibri" w:cs="Calibri" w:eastAsia="Calibri" w:hAnsi="Calibri"/>
+          <w:b w:val="false"/>
+          <w:bCs w:val="false"/>
+          <w:sz w:val="22"/>
+          <w:szCs w:val="22"/>
+        </w:rPr>
+        <w:t xml:space="preserve"> a elas além do armazenamento local no dispositivo do usuário.</w:t>
+      </w:r>
+    </w:p>
+    <w:p>
+      <w:pPr>
+        <w:spacing w:after="200"/>
+      </w:pPr>
+      <w:r>
+        <w:rPr>
+          <w:rFonts w:ascii="Calibri" w:cs="Calibri" w:eastAsia="Calibri" w:hAnsi="Calibri"/>
+          <w:b w:val="false"/>
+          <w:bCs w:val="false"/>
           <w:sz w:val="22"/>
           <w:szCs w:val="22"/>
         </w:rPr>
         <w:t xml:space="preserve">Qualquer custo de uso da API da Anthropic (ou de outros serviços de terceiros que exijam chave própria) é de responsabilidade exclusiva do usuário, conforme os termos de preço do respectivo provedor.</w:t>
+      </w:r>
+    </w:p>
+    <w:p>
+      <w:pPr>
+        <w:spacing w:after="200"/>
+      </w:pPr>
+      <w:r>
+        <w:rPr>
+          <w:rFonts w:ascii="Calibri" w:cs="Calibri" w:eastAsia="Calibri" w:hAnsi="Calibri"/>
+          <w:b w:val="false"/>
+          <w:bCs w:val="false"/>
+          <w:sz w:val="22"/>
+          <w:szCs w:val="22"/>
+        </w:rPr>
+        <w:t xml:space="preserve">O Desenvolvedor não garante a disponibilidade, exatidão, desempenho ou continuidade dos serviços de terceiros integrados ao Aplicativo (Anthropic, MyMemory, LibreTranslate, Hugging Face, GitHub). Alterações nos termos, preços, limites de uso ou a descontinuação desses serviços por seus respectivos provedores estão fora do controle do Desenvolvedor e podem afetar o funcionamento do Aplicativo, sem que isso gere direito a indenização.</w:t>
       </w:r>
     </w:p>
     <w:p>
@@ -232,16 +303,80 @@
           <w:sz w:val="24"/>
           <w:szCs w:val="24"/>
         </w:rPr>
-        <w:t xml:space="preserve">4. Uso Permitido</w:t>
-      </w:r>
-    </w:p>
-    <w:p>
-      <w:pPr>
-        <w:spacing w:after="200"/>
-      </w:pPr>
-      <w:r>
-        <w:rPr>
-          <w:rFonts w:ascii="Calibri" w:cs="Calibri" w:eastAsia="Calibri" w:hAnsi="Calibri"/>
+        <w:t xml:space="preserve">4. Disponibilidade, Suspensão e Descontinuação do Serviço</w:t>
+      </w:r>
+    </w:p>
+    <w:p>
+      <w:pPr>
+        <w:spacing w:after="200"/>
+      </w:pPr>
+      <w:r>
+        <w:rPr>
+          <w:rFonts w:ascii="Calibri" w:cs="Calibri" w:eastAsia="Calibri" w:hAnsi="Calibri"/>
+          <w:b w:val="false"/>
+          <w:bCs w:val="false"/>
+          <w:sz w:val="22"/>
+          <w:szCs w:val="22"/>
+        </w:rPr>
+        <w:t xml:space="preserve">O Aplicativo depende, em parte, de serviços gratuitos de terceiros (dicionário colaborativo, MyMemory, LibreTranslate) cuja disponibilidade contínua não é garantida pelo Desenvolvedor. O Desenvolvedor pode suspender, limitar ou descontinuar, a qualquer momento e sem aviso prévio, qualquer funcionalidade do Aplicativo — incluindo o modo gratuito, a contribuição ao dicionário colaborativo ou o próprio Aplicativo como um todo — sem que isso gere direito a indenização, reembolso (quando aplicável) ou qualquer outra compensação, ressalvadas as hipóteses de má-fé ou dolo do Desenvolvedor.</w:t>
+      </w:r>
+    </w:p>
+    <w:p>
+      <w:pPr>
+        <w:pStyle w:val="Heading1"/>
+        <w:spacing w:after="200" w:before="360"/>
+      </w:pPr>
+      <w:r>
+        <w:rPr>
+          <w:rFonts w:ascii="Calibri" w:cs="Calibri" w:eastAsia="Calibri" w:hAnsi="Calibri"/>
+          <w:b/>
+          <w:bCs/>
+          <w:sz w:val="24"/>
+          <w:szCs w:val="24"/>
+        </w:rPr>
+        <w:t xml:space="preserve">5. Atualizações do Aplicativo</w:t>
+      </w:r>
+    </w:p>
+    <w:p>
+      <w:pPr>
+        <w:spacing w:after="200"/>
+      </w:pPr>
+      <w:r>
+        <w:rPr>
+          <w:rFonts w:ascii="Calibri" w:cs="Calibri" w:eastAsia="Calibri" w:hAnsi="Calibri"/>
+          <w:b w:val="false"/>
+          <w:bCs w:val="false"/>
+          <w:sz w:val="22"/>
+          <w:szCs w:val="22"/>
+        </w:rPr>
+        <w:t xml:space="preserve">O Desenvolvedor pode, a seu critério, lançar atualizações que adicionem, modifiquem ou removam funcionalidades do Aplicativo, incluindo formatos de arquivo suportados. Não há garantia de suporte contínuo a versões antigas do Aplicativo, nem de compatibilidade retroativa entre versões. Recomenda-se manter o Aplicativo atualizado para melhor experiência e segurança.</w:t>
+      </w:r>
+    </w:p>
+    <w:p>
+      <w:pPr>
+        <w:pStyle w:val="Heading1"/>
+        <w:spacing w:after="200" w:before="360"/>
+      </w:pPr>
+      <w:r>
+        <w:rPr>
+          <w:rFonts w:ascii="Calibri" w:cs="Calibri" w:eastAsia="Calibri" w:hAnsi="Calibri"/>
+          <w:b/>
+          <w:bCs/>
+          <w:sz w:val="24"/>
+          <w:szCs w:val="24"/>
+        </w:rPr>
+        <w:t xml:space="preserve">6. Uso Permitido</w:t>
+      </w:r>
+    </w:p>
+    <w:p>
+      <w:pPr>
+        <w:spacing w:after="200"/>
+      </w:pPr>
+      <w:r>
+        <w:rPr>
+          <w:rFonts w:ascii="Calibri" w:cs="Calibri" w:eastAsia="Calibri" w:hAnsi="Calibri"/>
+          <w:b w:val="false"/>
+          <w:bCs w:val="false"/>
           <w:sz w:val="22"/>
           <w:szCs w:val="22"/>
         </w:rPr>
@@ -260,6 +395,8 @@
       <w:r>
         <w:rPr>
           <w:rFonts w:ascii="Calibri" w:cs="Calibri" w:eastAsia="Calibri" w:hAnsi="Calibri"/>
+          <w:b w:val="false"/>
+          <w:bCs w:val="false"/>
           <w:sz w:val="22"/>
           <w:szCs w:val="22"/>
         </w:rPr>
@@ -278,6 +415,8 @@
       <w:r>
         <w:rPr>
           <w:rFonts w:ascii="Calibri" w:cs="Calibri" w:eastAsia="Calibri" w:hAnsi="Calibri"/>
+          <w:b w:val="false"/>
+          <w:bCs w:val="false"/>
           <w:sz w:val="22"/>
           <w:szCs w:val="22"/>
         </w:rPr>
@@ -291,10 +430,32 @@
       <w:r>
         <w:rPr>
           <w:rFonts w:ascii="Calibri" w:cs="Calibri" w:eastAsia="Calibri" w:hAnsi="Calibri"/>
-          <w:sz w:val="22"/>
-          <w:szCs w:val="22"/>
-        </w:rPr>
-        <w:t xml:space="preserve">Você concorda em NÃO usar o Aplicativo para:</w:t>
+          <w:b w:val="false"/>
+          <w:bCs w:val="false"/>
+          <w:sz w:val="22"/>
+          <w:szCs w:val="22"/>
+        </w:rPr>
+        <w:t xml:space="preserve">Você concorda em </w:t>
+      </w:r>
+      <w:r>
+        <w:rPr>
+          <w:rFonts w:ascii="Calibri" w:cs="Calibri" w:eastAsia="Calibri" w:hAnsi="Calibri"/>
+          <w:b/>
+          <w:bCs/>
+          <w:sz w:val="22"/>
+          <w:szCs w:val="22"/>
+        </w:rPr>
+        <w:t xml:space="preserve">não</w:t>
+      </w:r>
+      <w:r>
+        <w:rPr>
+          <w:rFonts w:ascii="Calibri" w:cs="Calibri" w:eastAsia="Calibri" w:hAnsi="Calibri"/>
+          <w:b w:val="false"/>
+          <w:bCs w:val="false"/>
+          <w:sz w:val="22"/>
+          <w:szCs w:val="22"/>
+        </w:rPr>
+        <w:t xml:space="preserve"> usar o Aplicativo para:</w:t>
       </w:r>
     </w:p>
     <w:p>
@@ -309,6 +470,8 @@
       <w:r>
         <w:rPr>
           <w:rFonts w:ascii="Calibri" w:cs="Calibri" w:eastAsia="Calibri" w:hAnsi="Calibri"/>
+          <w:b w:val="false"/>
+          <w:bCs w:val="false"/>
           <w:sz w:val="22"/>
           <w:szCs w:val="22"/>
         </w:rPr>
@@ -327,10 +490,32 @@
       <w:r>
         <w:rPr>
           <w:rFonts w:ascii="Calibri" w:cs="Calibri" w:eastAsia="Calibri" w:hAnsi="Calibri"/>
-          <w:sz w:val="22"/>
-          <w:szCs w:val="22"/>
-        </w:rPr>
-        <w:t xml:space="preserve">Praticar engenharia reversa do software com o objetivo de contornar suas licenças ou revender o Aplicativo sem autorização;</w:t>
+          <w:b w:val="false"/>
+          <w:bCs w:val="false"/>
+          <w:sz w:val="22"/>
+          <w:szCs w:val="22"/>
+        </w:rPr>
+        <w:t xml:space="preserve">Praticar engenharia reversa, descompilação ou desmontagem do aplicativo </w:t>
+      </w:r>
+      <w:r>
+        <w:rPr>
+          <w:rFonts w:ascii="Calibri" w:cs="Calibri" w:eastAsia="Calibri" w:hAnsi="Calibri"/>
+          <w:b/>
+          <w:bCs/>
+          <w:sz w:val="22"/>
+          <w:szCs w:val="22"/>
+        </w:rPr>
+        <w:t xml:space="preserve">oficialmente distribuído</w:t>
+      </w:r>
+      <w:r>
+        <w:rPr>
+          <w:rFonts w:ascii="Calibri" w:cs="Calibri" w:eastAsia="Calibri" w:hAnsi="Calibri"/>
+          <w:b w:val="false"/>
+          <w:bCs w:val="false"/>
+          <w:sz w:val="22"/>
+          <w:szCs w:val="22"/>
+        </w:rPr>
+        <w:t xml:space="preserve"> (instalador Windows, pacote Android) com o objetivo de contornar mecanismos de licenciamento, autenticação ou proteção — sem prejuízo dos direitos já concedidos de forma independente sobre o código-fonte aberto, nos termos da Seção 8;</w:t>
       </w:r>
     </w:p>
     <w:p>
@@ -345,6 +530,8 @@
       <w:r>
         <w:rPr>
           <w:rFonts w:ascii="Calibri" w:cs="Calibri" w:eastAsia="Calibri" w:hAnsi="Calibri"/>
+          <w:b w:val="false"/>
+          <w:bCs w:val="false"/>
           <w:sz w:val="22"/>
           <w:szCs w:val="22"/>
         </w:rPr>
@@ -364,20 +551,57 @@
           <w:sz w:val="24"/>
           <w:szCs w:val="24"/>
         </w:rPr>
-        <w:t xml:space="preserve">5. Dicionário Colaborativo</w:t>
-      </w:r>
-    </w:p>
-    <w:p>
-      <w:pPr>
-        <w:spacing w:after="200"/>
-      </w:pPr>
-      <w:r>
-        <w:rPr>
-          <w:rFonts w:ascii="Calibri" w:cs="Calibri" w:eastAsia="Calibri" w:hAnsi="Calibri"/>
+        <w:t xml:space="preserve">7. Dicionário Colaborativo e Propriedade das Contribuições</w:t>
+      </w:r>
+    </w:p>
+    <w:p>
+      <w:pPr>
+        <w:spacing w:after="200"/>
+      </w:pPr>
+      <w:r>
+        <w:rPr>
+          <w:rFonts w:ascii="Calibri" w:cs="Calibri" w:eastAsia="Calibri" w:hAnsi="Calibri"/>
+          <w:b w:val="false"/>
+          <w:bCs w:val="false"/>
           <w:sz w:val="22"/>
           <w:szCs w:val="22"/>
         </w:rPr>
         <w:t xml:space="preserve">O Aplicativo contribui automaticamente, em segundo plano, com pares de texto original/traduzido para um dicionário público e de código aberto (ver Política do Dicionário). Ao usar o Aplicativo, você concorda que segmentos de texto traduzidos pelo Claude por meio dele podem ser publicados nesse dicionário público. O Aplicativo foi projetado para evitar a inclusão de dados pessoais nesse processo, mas não pode garantir de forma absoluta que nenhum segmento contenha, incidentalmente, informação desse tipo — ver a Política de Privacidade.</w:t>
+      </w:r>
+    </w:p>
+    <w:p>
+      <w:pPr>
+        <w:spacing w:after="200"/>
+      </w:pPr>
+      <w:r>
+        <w:rPr>
+          <w:rFonts w:ascii="Calibri" w:cs="Calibri" w:eastAsia="Calibri" w:hAnsi="Calibri"/>
+          <w:b w:val="false"/>
+          <w:bCs w:val="false"/>
+          <w:sz w:val="22"/>
+          <w:szCs w:val="22"/>
+        </w:rPr>
+        <w:t xml:space="preserve">Ao usar o Aplicativo, você reconhece e concorda que os segmentos de texto traduzidos pelo Claude e contribuídos ao dicionário colaborativo são publicados sob </w:t>
+      </w:r>
+      <w:r>
+        <w:rPr>
+          <w:rFonts w:ascii="Calibri" w:cs="Calibri" w:eastAsia="Calibri" w:hAnsi="Calibri"/>
+          <w:b/>
+          <w:bCs/>
+          <w:sz w:val="22"/>
+          <w:szCs w:val="22"/>
+        </w:rPr>
+        <w:t xml:space="preserve">licença CC0 1.0 Universal (domínio público)</w:t>
+      </w:r>
+      <w:r>
+        <w:rPr>
+          <w:rFonts w:ascii="Calibri" w:cs="Calibri" w:eastAsia="Calibri" w:hAnsi="Calibri"/>
+          <w:b w:val="false"/>
+          <w:bCs w:val="false"/>
+          <w:sz w:val="22"/>
+          <w:szCs w:val="22"/>
+        </w:rPr>
+        <w:t xml:space="preserve"> no repositório campfire-dictionary. Isso significa que você não retém, cede a terceiros ou reivindica qualquer direito de propriedade, exclusividade, atribuição ou remuneração sobre esses segmentos — eles passam a integrar um acervo de domínio público, disponível para uso irrestrito por qualquer pessoa.</w:t>
       </w:r>
     </w:p>
     <w:p>
@@ -393,20 +617,77 @@
           <w:sz w:val="24"/>
           <w:szCs w:val="24"/>
         </w:rPr>
-        <w:t xml:space="preserve">6. Propriedade Intelectual</w:t>
-      </w:r>
-    </w:p>
-    <w:p>
-      <w:pPr>
-        <w:spacing w:after="200"/>
-      </w:pPr>
-      <w:r>
-        <w:rPr>
-          <w:rFonts w:ascii="Calibri" w:cs="Calibri" w:eastAsia="Calibri" w:hAnsi="Calibri"/>
-          <w:sz w:val="22"/>
-          <w:szCs w:val="22"/>
-        </w:rPr>
-        <w:t xml:space="preserve">O código-fonte do Campfire Tradutor está disponível sob licença MIT no GitHub (github.com/Shirogoldboy/campfire-tradutor). O dicionário colaborativo (github.com/Shirogoldboy/campfire-dictionary) é público e está sob licença CC0 1.0 Universal (domínio público). Marcas, nome e identidade visual do Campfire Tradutor pertencem ao Desenvolvedor. Ver também o Aviso de Direitos Autorais para notificações de violação de direitos autorais.</w:t>
+        <w:t xml:space="preserve">8. Propriedade Intelectual</w:t>
+      </w:r>
+    </w:p>
+    <w:p>
+      <w:pPr>
+        <w:spacing w:after="200"/>
+      </w:pPr>
+      <w:r>
+        <w:rPr>
+          <w:rFonts w:ascii="Calibri" w:cs="Calibri" w:eastAsia="Calibri" w:hAnsi="Calibri"/>
+          <w:b w:val="false"/>
+          <w:bCs w:val="false"/>
+          <w:sz w:val="22"/>
+          <w:szCs w:val="22"/>
+        </w:rPr>
+        <w:t xml:space="preserve">As restrições de uso descritas na Seção 6 aplicam-se ao aplicativo </w:t>
+      </w:r>
+      <w:r>
+        <w:rPr>
+          <w:rFonts w:ascii="Calibri" w:cs="Calibri" w:eastAsia="Calibri" w:hAnsi="Calibri"/>
+          <w:b/>
+          <w:bCs/>
+          <w:sz w:val="22"/>
+          <w:szCs w:val="22"/>
+        </w:rPr>
+        <w:t xml:space="preserve">oficialmente distribuído</w:t>
+      </w:r>
+      <w:r>
+        <w:rPr>
+          <w:rFonts w:ascii="Calibri" w:cs="Calibri" w:eastAsia="Calibri" w:hAnsi="Calibri"/>
+          <w:b w:val="false"/>
+          <w:bCs w:val="false"/>
+          <w:sz w:val="22"/>
+          <w:szCs w:val="22"/>
+        </w:rPr>
+        <w:t xml:space="preserve"> (binários, instaladores e pacotes publicados pelo Desenvolvedor). Elas não restringem os direitos já concedidos, de forma independente, a qualquer pessoa que obtenha o código-fonte diretamente do repositório público sob </w:t>
+      </w:r>
+      <w:r>
+        <w:rPr>
+          <w:rFonts w:ascii="Calibri" w:cs="Calibri" w:eastAsia="Calibri" w:hAnsi="Calibri"/>
+          <w:b/>
+          <w:bCs/>
+          <w:sz w:val="22"/>
+          <w:szCs w:val="22"/>
+        </w:rPr>
+        <w:t xml:space="preserve">licença MIT</w:t>
+      </w:r>
+      <w:r>
+        <w:rPr>
+          <w:rFonts w:ascii="Calibri" w:cs="Calibri" w:eastAsia="Calibri" w:hAnsi="Calibri"/>
+          <w:b w:val="false"/>
+          <w:bCs w:val="false"/>
+          <w:sz w:val="22"/>
+          <w:szCs w:val="22"/>
+        </w:rPr>
+        <w:t xml:space="preserve"> (github.com/Shirogoldboy/campfire-tradutor) — a qual, por si só, permite uso, cópia, modificação, fusão, publicação, distribuição, sublicenciamento e venda de cópias do código-fonte, nos termos da própria licença MIT.</w:t>
+      </w:r>
+    </w:p>
+    <w:p>
+      <w:pPr>
+        <w:spacing w:after="200"/>
+      </w:pPr>
+      <w:r>
+        <w:rPr>
+          <w:rFonts w:ascii="Calibri" w:cs="Calibri" w:eastAsia="Calibri" w:hAnsi="Calibri"/>
+          <w:b w:val="false"/>
+          <w:bCs w:val="false"/>
+          <w:sz w:val="22"/>
+          <w:szCs w:val="22"/>
+        </w:rPr>
+        <w:t xml:space="preserve">O dicionário colaborativo (github.com/Shirogoldboy/campfire-dictionary) é público e está sob licença CC0 1.0 Universal (domínio público). Marcas, nome e identidade visual do Campfire Tradutor pertencem ao Desenvolvedor. Ver também o Aviso de Direitos Autorais para notificações de violação de direitos autorais.</w:t>
       </w:r>
     </w:p>
     <w:p>
@@ -422,16 +703,18 @@
           <w:sz w:val="24"/>
           <w:szCs w:val="24"/>
         </w:rPr>
-        <w:t xml:space="preserve">7. Isenção de Garantias</w:t>
-      </w:r>
-    </w:p>
-    <w:p>
-      <w:pPr>
-        <w:spacing w:after="200"/>
-      </w:pPr>
-      <w:r>
-        <w:rPr>
-          <w:rFonts w:ascii="Calibri" w:cs="Calibri" w:eastAsia="Calibri" w:hAnsi="Calibri"/>
+        <w:t xml:space="preserve">9. Isenção de Garantias</w:t>
+      </w:r>
+    </w:p>
+    <w:p>
+      <w:pPr>
+        <w:spacing w:after="200"/>
+      </w:pPr>
+      <w:r>
+        <w:rPr>
+          <w:rFonts w:ascii="Calibri" w:cs="Calibri" w:eastAsia="Calibri" w:hAnsi="Calibri"/>
+          <w:b w:val="false"/>
+          <w:bCs w:val="false"/>
           <w:sz w:val="22"/>
           <w:szCs w:val="22"/>
         </w:rPr>
@@ -451,16 +734,18 @@
           <w:sz w:val="24"/>
           <w:szCs w:val="24"/>
         </w:rPr>
-        <w:t xml:space="preserve">8. Limitação de Responsabilidade</w:t>
-      </w:r>
-    </w:p>
-    <w:p>
-      <w:pPr>
-        <w:spacing w:after="200"/>
-      </w:pPr>
-      <w:r>
-        <w:rPr>
-          <w:rFonts w:ascii="Calibri" w:cs="Calibri" w:eastAsia="Calibri" w:hAnsi="Calibri"/>
+        <w:t xml:space="preserve">10. Limitação de Responsabilidade</w:t>
+      </w:r>
+    </w:p>
+    <w:p>
+      <w:pPr>
+        <w:spacing w:after="200"/>
+      </w:pPr>
+      <w:r>
+        <w:rPr>
+          <w:rFonts w:ascii="Calibri" w:cs="Calibri" w:eastAsia="Calibri" w:hAnsi="Calibri"/>
+          <w:b w:val="false"/>
+          <w:bCs w:val="false"/>
           <w:sz w:val="22"/>
           <w:szCs w:val="22"/>
         </w:rPr>
@@ -474,10 +759,47 @@
       <w:r>
         <w:rPr>
           <w:rFonts w:ascii="Calibri" w:cs="Calibri" w:eastAsia="Calibri" w:hAnsi="Calibri"/>
-          <w:sz w:val="22"/>
-          <w:szCs w:val="22"/>
-        </w:rPr>
-        <w:t xml:space="preserve">Recomenda-se sempre manter backup dos arquivos originais antes de traduzi-los, especialmente arquivos binários de jogos e ROMs.</w:t>
+          <w:b w:val="false"/>
+          <w:bCs w:val="false"/>
+          <w:sz w:val="22"/>
+          <w:szCs w:val="22"/>
+        </w:rPr>
+        <w:t xml:space="preserve">Em particular, o Desenvolvedor não se responsabiliza por indisponibilidade, instabilidade, alteração de termos, encerramento ou qualquer outra ação unilateral dos provedores de serviços de terceiros integrados ao Aplicativo (Anthropic, MyMemory, LibreTranslate, Hugging Face, GitHub).</w:t>
+      </w:r>
+    </w:p>
+    <w:p>
+      <w:pPr>
+        <w:spacing w:after="200"/>
+      </w:pPr>
+      <w:r>
+        <w:rPr>
+          <w:rFonts w:ascii="Calibri" w:cs="Calibri" w:eastAsia="Calibri" w:hAnsi="Calibri"/>
+          <w:b w:val="false"/>
+          <w:bCs w:val="false"/>
+          <w:sz w:val="22"/>
+          <w:szCs w:val="22"/>
+        </w:rPr>
+        <w:t xml:space="preserve">Recomenda-se </w:t>
+      </w:r>
+      <w:r>
+        <w:rPr>
+          <w:rFonts w:ascii="Calibri" w:cs="Calibri" w:eastAsia="Calibri" w:hAnsi="Calibri"/>
+          <w:b/>
+          <w:bCs/>
+          <w:sz w:val="22"/>
+          <w:szCs w:val="22"/>
+        </w:rPr>
+        <w:t xml:space="preserve">sempre manter backup</w:t>
+      </w:r>
+      <w:r>
+        <w:rPr>
+          <w:rFonts w:ascii="Calibri" w:cs="Calibri" w:eastAsia="Calibri" w:hAnsi="Calibri"/>
+          <w:b w:val="false"/>
+          <w:bCs w:val="false"/>
+          <w:sz w:val="22"/>
+          <w:szCs w:val="22"/>
+        </w:rPr>
+        <w:t xml:space="preserve"> dos arquivos originais antes de traduzi-los, especialmente arquivos binários de jogos e ROMs.</w:t>
       </w:r>
     </w:p>
     <w:p>
@@ -493,16 +815,18 @@
           <w:sz w:val="24"/>
           <w:szCs w:val="24"/>
         </w:rPr>
-        <w:t xml:space="preserve">9. Alterações nos Termos</w:t>
-      </w:r>
-    </w:p>
-    <w:p>
-      <w:pPr>
-        <w:spacing w:after="200"/>
-      </w:pPr>
-      <w:r>
-        <w:rPr>
-          <w:rFonts w:ascii="Calibri" w:cs="Calibri" w:eastAsia="Calibri" w:hAnsi="Calibri"/>
+        <w:t xml:space="preserve">11. Alterações nos Termos</w:t>
+      </w:r>
+    </w:p>
+    <w:p>
+      <w:pPr>
+        <w:spacing w:after="200"/>
+      </w:pPr>
+      <w:r>
+        <w:rPr>
+          <w:rFonts w:ascii="Calibri" w:cs="Calibri" w:eastAsia="Calibri" w:hAnsi="Calibri"/>
+          <w:b w:val="false"/>
+          <w:bCs w:val="false"/>
           <w:sz w:val="22"/>
           <w:szCs w:val="22"/>
         </w:rPr>
@@ -522,16 +846,18 @@
           <w:sz w:val="24"/>
           <w:szCs w:val="24"/>
         </w:rPr>
-        <w:t xml:space="preserve">10. Lei Aplicável</w:t>
-      </w:r>
-    </w:p>
-    <w:p>
-      <w:pPr>
-        <w:spacing w:after="200"/>
-      </w:pPr>
-      <w:r>
-        <w:rPr>
-          <w:rFonts w:ascii="Calibri" w:cs="Calibri" w:eastAsia="Calibri" w:hAnsi="Calibri"/>
+        <w:t xml:space="preserve">12. Lei Aplicável</w:t>
+      </w:r>
+    </w:p>
+    <w:p>
+      <w:pPr>
+        <w:spacing w:after="200"/>
+      </w:pPr>
+      <w:r>
+        <w:rPr>
+          <w:rFonts w:ascii="Calibri" w:cs="Calibri" w:eastAsia="Calibri" w:hAnsi="Calibri"/>
+          <w:b w:val="false"/>
+          <w:bCs w:val="false"/>
           <w:sz w:val="22"/>
           <w:szCs w:val="22"/>
         </w:rPr>
@@ -551,16 +877,18 @@
           <w:sz w:val="24"/>
           <w:szCs w:val="24"/>
         </w:rPr>
-        <w:t xml:space="preserve">11. Contato</w:t>
-      </w:r>
-    </w:p>
-    <w:p>
-      <w:pPr>
-        <w:spacing w:after="200"/>
-      </w:pPr>
-      <w:r>
-        <w:rPr>
-          <w:rFonts w:ascii="Calibri" w:cs="Calibri" w:eastAsia="Calibri" w:hAnsi="Calibri"/>
+        <w:t xml:space="preserve">13. Contato</w:t>
+      </w:r>
+    </w:p>
+    <w:p>
+      <w:pPr>
+        <w:spacing w:after="200"/>
+      </w:pPr>
+      <w:r>
+        <w:rPr>
+          <w:rFonts w:ascii="Calibri" w:cs="Calibri" w:eastAsia="Calibri" w:hAnsi="Calibri"/>
+          <w:b w:val="false"/>
+          <w:bCs w:val="false"/>
           <w:sz w:val="22"/>
           <w:szCs w:val="22"/>
         </w:rPr>

</xml_diff>